<commit_message>
Aula 13: fork como passo próprio (botão 1 do portal) e aviso de e-mail verificado
</commit_message>
<xml_diff>
--- a/Aula 13 - 27-10-2026/Aula 13 - Apostila do Aluno.docx
+++ b/Aula 13 - 27-10-2026/Aula 13 - Apostila do Aluno.docx
@@ -5124,7 +5124,7 @@
         <w:rPr>
           <w:i w:val="0"/>
         </w:rPr>
-        <w:t>Cada dev vai criar o SEU card na pasta equipe/. Como cada um cria um arquivo próprio (seu-usuario.md), ninguém mexe no arquivo do outro — e não há conflito. Tudo pelo navegador: a página Começar do portal (aprendendodev.com.br/comecar.html) monta o card, e o GitHub cria o fork e a branch sozinho. As figuras são ESQUEMAS das telas do GitHub; os botões têm os mesmos nomes (em inglês), mas a aparência pode mudar um pouco.</w:t>
+        <w:t>Cada dev vai criar o SEU card na pasta equipe/. Como cada um cria um arquivo próprio (seu-usuario.md), ninguém mexe no arquivo do outro — e não há conflito. Tudo pelo navegador: a página Começar do portal (aprendendodev.com.br/comecar.html) monta o card e traz dois botões: o 1 cria o seu fork (uma vez só) e o 2 abre o GitHub com o arquivo pronto; a branch o GitHub cria sozinho. As figuras são ESQUEMAS das telas do GitHub; os botões têm os mesmos nomes (em inglês), mas a aparência pode mudar um pouco.</w:t>
       </w:r>
     </w:p>
     <w:p>
@@ -5439,7 +5439,7 @@
         <w:rPr>
           <w:i w:val="0"/>
         </w:rPr>
-        <w:t>Abra aprendendodev.com.br e clique em Começar. Preencha o primeiro nome, o usuário do GitHub, o squad (o professor anuncia hoje; squad cheio fica bloqueado) e as duas frases. Confira a prévia e clique em Criar o meu card no GitHub: o GitHub abre com o arquivo pronto, e o texto do card também fica copiado.</w:t>
+        <w:t>Abra aprendendodev.com.br e clique em Começar. Preencha o primeiro nome, o usuário do GitHub, o squad (o professor anuncia hoje; squad cheio fica bloqueado) e as duas frases. Confira a prévia: embaixo aparecem os botões 1. Criar o meu fork e 2. Criar o meu card no GitHub. Use primeiro o 1 e depois o 2.</w:t>
       </w:r>
     </w:p>
     <w:p>
@@ -5449,7 +5449,7 @@
       <w:r>
         <w:drawing>
           <wp:inline xmlns:a="http://schemas.openxmlformats.org/drawingml/2006/main" xmlns:pic="http://schemas.openxmlformats.org/drawingml/2006/picture">
-            <wp:extent cx="4206240" cy="4073411"/>
+            <wp:extent cx="4206240" cy="4359522"/>
             <wp:docPr id="10" name="Picture 10"/>
             <wp:cNvGraphicFramePr>
               <a:graphicFrameLocks noChangeAspect="1"/>
@@ -5470,7 +5470,7 @@
                   <pic:spPr>
                     <a:xfrm>
                       <a:off x="0" y="0"/>
-                      <a:ext cx="4206240" cy="4073411"/>
+                      <a:ext cx="4206240" cy="4359522"/>
                     </a:xfrm>
                     <a:prstGeom prst="rect"/>
                   </pic:spPr>
@@ -5502,7 +5502,7 @@
         <w:rPr>
           <w:i w:val="0"/>
         </w:rPr>
-        <w:t>O GitHub avisa que, para propor mudanças, você precisa de um fork. Clique em Fork this repository: agora existe seu-usuario/techburger, a SUA cópia.</w:t>
+        <w:t>Clique em 1. Criar o meu fork: abre a página Create a new fork do GitHub. Deixe o dono (Owner) como o seu usuário e o nome techburger, e clique em Create fork. Agora existe seu-usuario/techburger, a SUA cópia. É uma vez só: o mesmo fork serve para todas as tarefas do projeto. Se nada acontecer ao clicar, o seu e-mail ainda não foi confirmado: abra o e-mail do GitHub (ou Settings › Emails), confirme e tente de novo.</w:t>
       </w:r>
     </w:p>
     <w:p>
@@ -5571,7 +5571,7 @@
         <w:rPr>
           <w:i w:val="0"/>
         </w:rPr>
-        <w:t>O nome (seu-usuario.md) e o texto do card já vêm preenchidos. Confira o caminho techburger / equipe / seu-usuario.md e o squad. Se a caixa vier vazia, digite o nome do arquivo e cole o texto (Ctrl+V). Só o primeiro nome, nada de dado pessoal.</w:t>
+        <w:t>Volte ao portal e clique em 2. Criar o meu card no GitHub. O nome (seu-usuario.md) e o texto do card já vêm preenchidos (o texto também fica copiado). Confira o caminho techburger / equipe / seu-usuario.md e o squad. Se a caixa vier vazia, digite o nome do arquivo e cole o texto (Ctrl+V). Só o primeiro nome, nada de dado pessoal.</w:t>
       </w:r>
     </w:p>
     <w:p>

</xml_diff>